<commit_message>
[auto-build] Rebuild reference document
</commit_message>
<xml_diff>
--- a/Versions-html-and-docx/section_synthese_v6.docx
+++ b/Versions-html-and-docx/section_synthese_v6.docx
@@ -173,7 +173,7 @@
       <w:r>
         <w:drawing>
           <wp:inline xmlns:a="http://schemas.openxmlformats.org/drawingml/2006/main" xmlns:pic="http://schemas.openxmlformats.org/drawingml/2006/picture">
-            <wp:extent cx="5943600" cy="4669971"/>
+            <wp:extent cx="5943600" cy="4457700"/>
             <wp:docPr id="3" name="Picture 3"/>
             <wp:cNvGraphicFramePr>
               <a:graphicFrameLocks noChangeAspect="1"/>
@@ -194,7 +194,7 @@
                   <pic:spPr>
                     <a:xfrm>
                       <a:off x="0" y="0"/>
-                      <a:ext cx="5943600" cy="4669971"/>
+                      <a:ext cx="5943600" cy="4457700"/>
                     </a:xfrm>
                     <a:prstGeom prst="rect"/>
                   </pic:spPr>
@@ -4569,7 +4569,7 @@
           <w:i w:val="0"/>
           <w:sz w:val="20"/>
         </w:rPr>
-        <w:t>Quand deux instruments partagent un F1 similaire (Δ ≤ 80 Hz), leurs timbres fusionnent : l'oreille perçoit une couleur homogène plutôt que deux voix distinctes. Ce phénomène est la base acoustique des doublures classiques les plus efficaces. Seuils mesurés dans le corpus : Δ = 0 Hz — unisson formantique : Flûte (743) + Hautbois (743) ; Tuba contrebasse + Contrebasson + Tuba basse (tous à 226 Hz) — trois familles, une seule couleur. Δ ≤ 30 Hz — fusion quasi-parfaite : Basson (495) + Violoncelle (205) Δ=11 Hz ; Cor (388) + Alto (377) Δ=11 Hz ; Trombone (237) + Tuba basse (226) Δ=11 Hz ; Trombone (237) + Trombone basse (258) Δ=21 Hz. Δ 30–80 Hz — fusion efficace : Cor anglais (452) + Clarinette Sib (463) Δ=11 Hz. Conséquence pratique : la fusion ne dépend pas de l'unisson mélodique — Basson et Violoncelle fusionnent à n'importe quel intervalle harmonique. C'est pourquoi ces doublures fonctionnent sur plusieurs octaves. La convergence formantique est une propriété du timbre, pas de la hauteur.</w:t>
+        <w:t>Quand deux instruments partagent un F1 similaire (Δ ≤ 80 Hz), leurs timbres fusionnent : l'oreille perçoit une couleur homogène plutôt que deux voix distinctes. Ce phénomène est la base acoustique des doublures classiques les plus efficaces. Seuils mesurés dans le corpus : Δ = 0 Hz (0 Bark) — unisson formantique : Flûte (743) + Hautbois (743) ; Tuba contrebasse + Contrebasson + Tuba basse (tous à 226 Hz) — trois familles, une seule couleur. Δ ≤ 30 Hz (≤ 0,3 Bark) — fusion quasi-parfaite : Basson (495) + Violoncelle (205) Δ=11 Hz ; Cor (388) + Alto (377) Δ=11 Hz ; Trombone (237) + Tuba basse (226) Δ=11 Hz ; Trombone (237) + Trombone basse (258) Δ=21 Hz. Δ 30–80 Hz (0,3–0,7 Bark) — fusion efficace : Cor anglais (452) + Clarinette Sib (463) Δ=11 Hz. Δ ≥ 200 Hz (≥ 1,5 Bark) — complémentarité spectrale : les spectres coexistent sans masquage. Conséquence pratique : la fusion ne dépend pas de l'unisson mélodique — Basson et Violoncelle fusionnent à n'importe quel intervalle harmonique. C'est pourquoi ces doublures fonctionnent sur plusieurs octaves. La convergence formantique est une propriété du timbre, pas de la hauteur.</w:t>
       </w:r>
     </w:p>
     <w:p>
@@ -4740,6 +4740,1722 @@
         <w:t>Le Fp varie peu d'un registre à l'autre pour un même instrument. Exemples : cor Fp = 698–724 Hz sur 4 registres (variation &amp;lt; 4 %), trombone Fp = 1 217–1 290 Hz (variation 6 %), violoncelle Fp = 965–1 020 Hz (variation 6 %). Cela confirme que le Fp capture une caractéristique structurelle de l'instrument — résonance du corps, du pavillon ou de la caisse — indépendante de la note jouée. Conséquence : les convergences Fp inter-instruments sont robustes quel que soit le registre. Le trombone (Fp ≈ 1 217–1 260 Hz) converge avec la contrebasse (Fp ≈ 1 283–1 297 Hz) dans tous les registres. Le basson (Fp ≈ 1 063–1 109 Hz) converge avec la trompette (Fp ≈ 1 043–1 088 Hz) de manière stable. Le Fp est donc la mesure la plus fiable pour prédire la fusion timbrale entre instruments à grande tessiture — là où F1 et F2 sont trop instables pour servir de référence.</w:t>
       </w:r>
     </w:p>
+    <w:p/>
+    <w:p>
+      <w:pPr>
+        <w:pStyle w:val="Heading2"/>
+      </w:pPr>
+      <w:r>
+        <w:rPr>
+          <w:color w:val="1565C0"/>
+        </w:rPr>
+        <w:t>Tableau de référence Fp — bandes de calcul et contexte</w:t>
+      </w:r>
+    </w:p>
+    <w:p>
+      <w:r>
+        <w:rPr>
+          <w:b w:val="0"/>
+          <w:i/>
+          <w:sz w:val="18"/>
+        </w:rPr>
+        <w:t>Valeurs Fp de référence (soliste, ordinario). Les variantes ensemble/sourdine sont documentées dans les sections instrumentales.</w:t>
+      </w:r>
+    </w:p>
+    <w:tbl>
+      <w:tblPr>
+        <w:tblStyle w:val="TableGrid"/>
+        <w:tblW w:type="auto" w:w="0"/>
+        <w:tblLook w:firstColumn="1" w:firstRow="1" w:lastColumn="0" w:lastRow="0" w:noHBand="0" w:noVBand="1" w:val="04A0"/>
+      </w:tblPr>
+      <w:tblGrid>
+        <w:gridCol w:w="1384"/>
+        <w:gridCol w:w="1384"/>
+        <w:gridCol w:w="1384"/>
+        <w:gridCol w:w="1384"/>
+        <w:gridCol w:w="1384"/>
+        <w:gridCol w:w="1384"/>
+        <w:gridCol w:w="1384"/>
+      </w:tblGrid>
+      <w:tr>
+        <w:tc>
+          <w:tcPr>
+            <w:tcW w:type="dxa" w:w="1384"/>
+            <w:shd w:fill="1565C0"/>
+          </w:tcPr>
+          <w:p>
+            <w:pPr>
+              <w:jc w:val="center"/>
+            </w:pPr>
+            <w:r/>
+            <w:r>
+              <w:rPr>
+                <w:b/>
+                <w:color w:val="FFFFFF"/>
+                <w:sz w:val="16"/>
+              </w:rPr>
+              <w:t>Instrument</w:t>
+            </w:r>
+          </w:p>
+        </w:tc>
+        <w:tc>
+          <w:tcPr>
+            <w:tcW w:type="dxa" w:w="1384"/>
+            <w:shd w:fill="1565C0"/>
+          </w:tcPr>
+          <w:p>
+            <w:pPr>
+              <w:jc w:val="center"/>
+            </w:pPr>
+            <w:r/>
+            <w:r>
+              <w:rPr>
+                <w:b/>
+                <w:color w:val="FFFFFF"/>
+                <w:sz w:val="16"/>
+              </w:rPr>
+              <w:t>Fp réf.</w:t>
+            </w:r>
+          </w:p>
+        </w:tc>
+        <w:tc>
+          <w:tcPr>
+            <w:tcW w:type="dxa" w:w="1384"/>
+            <w:shd w:fill="1565C0"/>
+          </w:tcPr>
+          <w:p>
+            <w:pPr>
+              <w:jc w:val="center"/>
+            </w:pPr>
+            <w:r/>
+            <w:r>
+              <w:rPr>
+                <w:b/>
+                <w:color w:val="FFFFFF"/>
+                <w:sz w:val="16"/>
+              </w:rPr>
+              <w:t>Bande</w:t>
+            </w:r>
+          </w:p>
+        </w:tc>
+        <w:tc>
+          <w:tcPr>
+            <w:tcW w:type="dxa" w:w="1384"/>
+            <w:shd w:fill="1565C0"/>
+          </w:tcPr>
+          <w:p>
+            <w:pPr>
+              <w:jc w:val="center"/>
+            </w:pPr>
+            <w:r/>
+            <w:r>
+              <w:rPr>
+                <w:b/>
+                <w:color w:val="FFFFFF"/>
+                <w:sz w:val="16"/>
+              </w:rPr>
+              <w:t>σ(Fp)</w:t>
+            </w:r>
+          </w:p>
+        </w:tc>
+        <w:tc>
+          <w:tcPr>
+            <w:tcW w:type="dxa" w:w="1384"/>
+            <w:shd w:fill="1565C0"/>
+          </w:tcPr>
+          <w:p>
+            <w:pPr>
+              <w:jc w:val="center"/>
+            </w:pPr>
+            <w:r/>
+            <w:r>
+              <w:rPr>
+                <w:b/>
+                <w:color w:val="FFFFFF"/>
+                <w:sz w:val="16"/>
+              </w:rPr>
+              <w:t>Contexte</w:t>
+            </w:r>
+          </w:p>
+        </w:tc>
+        <w:tc>
+          <w:tcPr>
+            <w:tcW w:type="dxa" w:w="1384"/>
+            <w:shd w:fill="1565C0"/>
+          </w:tcPr>
+          <w:p>
+            <w:pPr>
+              <w:jc w:val="center"/>
+            </w:pPr>
+            <w:r/>
+            <w:r>
+              <w:rPr>
+                <w:b/>
+                <w:color w:val="FFFFFF"/>
+                <w:sz w:val="16"/>
+              </w:rPr>
+              <w:t>N</w:t>
+            </w:r>
+          </w:p>
+        </w:tc>
+        <w:tc>
+          <w:tcPr>
+            <w:tcW w:type="dxa" w:w="1384"/>
+            <w:shd w:fill="1565C0"/>
+          </w:tcPr>
+          <w:p>
+            <w:pPr>
+              <w:jc w:val="center"/>
+            </w:pPr>
+            <w:r/>
+            <w:r>
+              <w:rPr>
+                <w:b/>
+                <w:color w:val="FFFFFF"/>
+                <w:sz w:val="16"/>
+              </w:rPr>
+              <w:t>Notes</w:t>
+            </w:r>
+          </w:p>
+        </w:tc>
+      </w:tr>
+      <w:tr>
+        <w:tc>
+          <w:tcPr>
+            <w:tcW w:type="dxa" w:w="1384"/>
+          </w:tcPr>
+          <w:p>
+            <w:pPr>
+              <w:jc w:val="center"/>
+            </w:pPr>
+            <w:r/>
+            <w:r>
+              <w:rPr>
+                <w:b/>
+                <w:sz w:val="16"/>
+              </w:rPr>
+              <w:t>Flûte</w:t>
+            </w:r>
+          </w:p>
+        </w:tc>
+        <w:tc>
+          <w:tcPr>
+            <w:tcW w:type="dxa" w:w="1384"/>
+          </w:tcPr>
+          <w:p>
+            <w:pPr>
+              <w:jc w:val="center"/>
+            </w:pPr>
+            <w:r/>
+            <w:r>
+              <w:rPr>
+                <w:b w:val="0"/>
+                <w:sz w:val="16"/>
+              </w:rPr>
+              <w:t>1 535</w:t>
+            </w:r>
+          </w:p>
+        </w:tc>
+        <w:tc>
+          <w:tcPr>
+            <w:tcW w:type="dxa" w:w="1384"/>
+          </w:tcPr>
+          <w:p>
+            <w:pPr>
+              <w:jc w:val="center"/>
+            </w:pPr>
+            <w:r/>
+            <w:r>
+              <w:rPr>
+                <w:b w:val="0"/>
+                <w:sz w:val="16"/>
+              </w:rPr>
+              <w:t>1 000–2 000</w:t>
+            </w:r>
+          </w:p>
+        </w:tc>
+        <w:tc>
+          <w:tcPr>
+            <w:tcW w:type="dxa" w:w="1384"/>
+          </w:tcPr>
+          <w:p>
+            <w:pPr>
+              <w:jc w:val="center"/>
+            </w:pPr>
+            <w:r/>
+            <w:r>
+              <w:rPr>
+                <w:b w:val="0"/>
+                <w:sz w:val="16"/>
+              </w:rPr>
+              <w:t>~150</w:t>
+            </w:r>
+          </w:p>
+        </w:tc>
+        <w:tc>
+          <w:tcPr>
+            <w:tcW w:type="dxa" w:w="1384"/>
+          </w:tcPr>
+          <w:p>
+            <w:pPr>
+              <w:jc w:val="center"/>
+            </w:pPr>
+            <w:r/>
+            <w:r>
+              <w:rPr>
+                <w:b w:val="0"/>
+                <w:sz w:val="16"/>
+              </w:rPr>
+              <w:t>Solo ord.</w:t>
+            </w:r>
+          </w:p>
+        </w:tc>
+        <w:tc>
+          <w:tcPr>
+            <w:tcW w:type="dxa" w:w="1384"/>
+          </w:tcPr>
+          <w:p>
+            <w:pPr>
+              <w:jc w:val="center"/>
+            </w:pPr>
+            <w:r/>
+            <w:r>
+              <w:rPr>
+                <w:b w:val="0"/>
+                <w:sz w:val="16"/>
+              </w:rPr>
+              <w:t>118</w:t>
+            </w:r>
+          </w:p>
+        </w:tc>
+        <w:tc>
+          <w:tcPr>
+            <w:tcW w:type="dxa" w:w="1384"/>
+          </w:tcPr>
+          <w:p>
+            <w:pPr>
+              <w:jc w:val="center"/>
+            </w:pPr>
+            <w:r/>
+            <w:r>
+              <w:rPr>
+                <w:b w:val="0"/>
+                <w:sz w:val="16"/>
+              </w:rPr>
+              <w:t>—</w:t>
+            </w:r>
+          </w:p>
+        </w:tc>
+      </w:tr>
+      <w:tr>
+        <w:tc>
+          <w:tcPr>
+            <w:tcW w:type="dxa" w:w="1384"/>
+          </w:tcPr>
+          <w:p>
+            <w:pPr>
+              <w:jc w:val="center"/>
+            </w:pPr>
+            <w:r/>
+            <w:r>
+              <w:rPr>
+                <w:b/>
+                <w:sz w:val="16"/>
+              </w:rPr>
+              <w:t>Hautbois</w:t>
+            </w:r>
+          </w:p>
+        </w:tc>
+        <w:tc>
+          <w:tcPr>
+            <w:tcW w:type="dxa" w:w="1384"/>
+          </w:tcPr>
+          <w:p>
+            <w:pPr>
+              <w:jc w:val="center"/>
+            </w:pPr>
+            <w:r/>
+            <w:r>
+              <w:rPr>
+                <w:b w:val="0"/>
+                <w:sz w:val="16"/>
+              </w:rPr>
+              <w:t>1 485</w:t>
+            </w:r>
+          </w:p>
+        </w:tc>
+        <w:tc>
+          <w:tcPr>
+            <w:tcW w:type="dxa" w:w="1384"/>
+          </w:tcPr>
+          <w:p>
+            <w:pPr>
+              <w:jc w:val="center"/>
+            </w:pPr>
+            <w:r/>
+            <w:r>
+              <w:rPr>
+                <w:b w:val="0"/>
+                <w:sz w:val="16"/>
+              </w:rPr>
+              <w:t>1 000–2 000</w:t>
+            </w:r>
+          </w:p>
+        </w:tc>
+        <w:tc>
+          <w:tcPr>
+            <w:tcW w:type="dxa" w:w="1384"/>
+          </w:tcPr>
+          <w:p>
+            <w:pPr>
+              <w:jc w:val="center"/>
+            </w:pPr>
+            <w:r/>
+            <w:r>
+              <w:rPr>
+                <w:b w:val="0"/>
+                <w:sz w:val="16"/>
+              </w:rPr>
+              <w:t>~90</w:t>
+            </w:r>
+          </w:p>
+        </w:tc>
+        <w:tc>
+          <w:tcPr>
+            <w:tcW w:type="dxa" w:w="1384"/>
+          </w:tcPr>
+          <w:p>
+            <w:pPr>
+              <w:jc w:val="center"/>
+            </w:pPr>
+            <w:r/>
+            <w:r>
+              <w:rPr>
+                <w:b w:val="0"/>
+                <w:sz w:val="16"/>
+              </w:rPr>
+              <w:t>Solo ord.</w:t>
+            </w:r>
+          </w:p>
+        </w:tc>
+        <w:tc>
+          <w:tcPr>
+            <w:tcW w:type="dxa" w:w="1384"/>
+          </w:tcPr>
+          <w:p>
+            <w:pPr>
+              <w:jc w:val="center"/>
+            </w:pPr>
+            <w:r/>
+            <w:r>
+              <w:rPr>
+                <w:b w:val="0"/>
+                <w:sz w:val="16"/>
+              </w:rPr>
+              <w:t>107</w:t>
+            </w:r>
+          </w:p>
+        </w:tc>
+        <w:tc>
+          <w:tcPr>
+            <w:tcW w:type="dxa" w:w="1384"/>
+          </w:tcPr>
+          <w:p>
+            <w:pPr>
+              <w:jc w:val="center"/>
+            </w:pPr>
+            <w:r/>
+            <w:r>
+              <w:rPr>
+                <w:b w:val="0"/>
+                <w:sz w:val="16"/>
+              </w:rPr>
+              <w:t>Stable 6 %</w:t>
+            </w:r>
+          </w:p>
+        </w:tc>
+      </w:tr>
+      <w:tr>
+        <w:tc>
+          <w:tcPr>
+            <w:tcW w:type="dxa" w:w="1384"/>
+          </w:tcPr>
+          <w:p>
+            <w:pPr>
+              <w:jc w:val="center"/>
+            </w:pPr>
+            <w:r/>
+            <w:r>
+              <w:rPr>
+                <w:b/>
+                <w:sz w:val="16"/>
+              </w:rPr>
+              <w:t>Clarinette Sib</w:t>
+            </w:r>
+          </w:p>
+        </w:tc>
+        <w:tc>
+          <w:tcPr>
+            <w:tcW w:type="dxa" w:w="1384"/>
+          </w:tcPr>
+          <w:p>
+            <w:pPr>
+              <w:jc w:val="center"/>
+            </w:pPr>
+            <w:r/>
+            <w:r>
+              <w:rPr>
+                <w:b w:val="0"/>
+                <w:sz w:val="16"/>
+              </w:rPr>
+              <w:t>1 412</w:t>
+            </w:r>
+          </w:p>
+        </w:tc>
+        <w:tc>
+          <w:tcPr>
+            <w:tcW w:type="dxa" w:w="1384"/>
+          </w:tcPr>
+          <w:p>
+            <w:pPr>
+              <w:jc w:val="center"/>
+            </w:pPr>
+            <w:r/>
+            <w:r>
+              <w:rPr>
+                <w:b w:val="0"/>
+                <w:sz w:val="16"/>
+              </w:rPr>
+              <w:t>1 000–2 000</w:t>
+            </w:r>
+          </w:p>
+        </w:tc>
+        <w:tc>
+          <w:tcPr>
+            <w:tcW w:type="dxa" w:w="1384"/>
+          </w:tcPr>
+          <w:p>
+            <w:pPr>
+              <w:jc w:val="center"/>
+            </w:pPr>
+            <w:r/>
+            <w:r>
+              <w:rPr>
+                <w:b w:val="0"/>
+                <w:sz w:val="16"/>
+              </w:rPr>
+              <w:t>169</w:t>
+            </w:r>
+          </w:p>
+        </w:tc>
+        <w:tc>
+          <w:tcPr>
+            <w:tcW w:type="dxa" w:w="1384"/>
+          </w:tcPr>
+          <w:p>
+            <w:pPr>
+              <w:jc w:val="center"/>
+            </w:pPr>
+            <w:r/>
+            <w:r>
+              <w:rPr>
+                <w:b w:val="0"/>
+                <w:sz w:val="16"/>
+              </w:rPr>
+              <w:t>Solo ord.</w:t>
+            </w:r>
+          </w:p>
+        </w:tc>
+        <w:tc>
+          <w:tcPr>
+            <w:tcW w:type="dxa" w:w="1384"/>
+          </w:tcPr>
+          <w:p>
+            <w:pPr>
+              <w:jc w:val="center"/>
+            </w:pPr>
+            <w:r/>
+            <w:r>
+              <w:rPr>
+                <w:b w:val="0"/>
+                <w:sz w:val="16"/>
+              </w:rPr>
+              <w:t>126</w:t>
+            </w:r>
+          </w:p>
+        </w:tc>
+        <w:tc>
+          <w:tcPr>
+            <w:tcW w:type="dxa" w:w="1384"/>
+          </w:tcPr>
+          <w:p>
+            <w:pPr>
+              <w:jc w:val="center"/>
+            </w:pPr>
+            <w:r/>
+            <w:r>
+              <w:rPr>
+                <w:b w:val="0"/>
+                <w:sz w:val="16"/>
+              </w:rPr>
+              <w:t>Var. 1 296 (800–1 600)</w:t>
+            </w:r>
+          </w:p>
+        </w:tc>
+      </w:tr>
+      <w:tr>
+        <w:tc>
+          <w:tcPr>
+            <w:tcW w:type="dxa" w:w="1384"/>
+          </w:tcPr>
+          <w:p>
+            <w:pPr>
+              <w:jc w:val="center"/>
+            </w:pPr>
+            <w:r/>
+            <w:r>
+              <w:rPr>
+                <w:b/>
+                <w:sz w:val="16"/>
+              </w:rPr>
+              <w:t>Basson</w:t>
+            </w:r>
+          </w:p>
+        </w:tc>
+        <w:tc>
+          <w:tcPr>
+            <w:tcW w:type="dxa" w:w="1384"/>
+          </w:tcPr>
+          <w:p>
+            <w:pPr>
+              <w:jc w:val="center"/>
+            </w:pPr>
+            <w:r/>
+            <w:r>
+              <w:rPr>
+                <w:b w:val="0"/>
+                <w:sz w:val="16"/>
+              </w:rPr>
+              <w:t>1 079</w:t>
+            </w:r>
+          </w:p>
+        </w:tc>
+        <w:tc>
+          <w:tcPr>
+            <w:tcW w:type="dxa" w:w="1384"/>
+          </w:tcPr>
+          <w:p>
+            <w:pPr>
+              <w:jc w:val="center"/>
+            </w:pPr>
+            <w:r/>
+            <w:r>
+              <w:rPr>
+                <w:b w:val="0"/>
+                <w:sz w:val="16"/>
+              </w:rPr>
+              <w:t>800–1 600</w:t>
+            </w:r>
+          </w:p>
+        </w:tc>
+        <w:tc>
+          <w:tcPr>
+            <w:tcW w:type="dxa" w:w="1384"/>
+          </w:tcPr>
+          <w:p>
+            <w:pPr>
+              <w:jc w:val="center"/>
+            </w:pPr>
+            <w:r/>
+            <w:r>
+              <w:rPr>
+                <w:b w:val="0"/>
+                <w:sz w:val="16"/>
+              </w:rPr>
+              <w:t>~60</w:t>
+            </w:r>
+          </w:p>
+        </w:tc>
+        <w:tc>
+          <w:tcPr>
+            <w:tcW w:type="dxa" w:w="1384"/>
+          </w:tcPr>
+          <w:p>
+            <w:pPr>
+              <w:jc w:val="center"/>
+            </w:pPr>
+            <w:r/>
+            <w:r>
+              <w:rPr>
+                <w:b w:val="0"/>
+                <w:sz w:val="16"/>
+              </w:rPr>
+              <w:t>Solo ord.</w:t>
+            </w:r>
+          </w:p>
+        </w:tc>
+        <w:tc>
+          <w:tcPr>
+            <w:tcW w:type="dxa" w:w="1384"/>
+          </w:tcPr>
+          <w:p>
+            <w:pPr>
+              <w:jc w:val="center"/>
+            </w:pPr>
+            <w:r/>
+            <w:r>
+              <w:rPr>
+                <w:b w:val="0"/>
+                <w:sz w:val="16"/>
+              </w:rPr>
+              <w:t>126</w:t>
+            </w:r>
+          </w:p>
+        </w:tc>
+        <w:tc>
+          <w:tcPr>
+            <w:tcW w:type="dxa" w:w="1384"/>
+          </w:tcPr>
+          <w:p>
+            <w:pPr>
+              <w:jc w:val="center"/>
+            </w:pPr>
+            <w:r/>
+            <w:r>
+              <w:rPr>
+                <w:b w:val="0"/>
+                <w:sz w:val="16"/>
+              </w:rPr>
+              <w:t>Très stable 4 %</w:t>
+            </w:r>
+          </w:p>
+        </w:tc>
+      </w:tr>
+      <w:tr>
+        <w:tc>
+          <w:tcPr>
+            <w:tcW w:type="dxa" w:w="1384"/>
+          </w:tcPr>
+          <w:p>
+            <w:pPr>
+              <w:jc w:val="center"/>
+            </w:pPr>
+            <w:r/>
+            <w:r>
+              <w:rPr>
+                <w:b/>
+                <w:sz w:val="16"/>
+              </w:rPr>
+              <w:t>Cor</w:t>
+            </w:r>
+          </w:p>
+        </w:tc>
+        <w:tc>
+          <w:tcPr>
+            <w:tcW w:type="dxa" w:w="1384"/>
+          </w:tcPr>
+          <w:p>
+            <w:pPr>
+              <w:jc w:val="center"/>
+            </w:pPr>
+            <w:r/>
+            <w:r>
+              <w:rPr>
+                <w:b w:val="0"/>
+                <w:sz w:val="16"/>
+              </w:rPr>
+              <w:t>738</w:t>
+            </w:r>
+          </w:p>
+        </w:tc>
+        <w:tc>
+          <w:tcPr>
+            <w:tcW w:type="dxa" w:w="1384"/>
+          </w:tcPr>
+          <w:p>
+            <w:pPr>
+              <w:jc w:val="center"/>
+            </w:pPr>
+            <w:r/>
+            <w:r>
+              <w:rPr>
+                <w:b w:val="0"/>
+                <w:sz w:val="16"/>
+              </w:rPr>
+              <w:t>600–1 400</w:t>
+            </w:r>
+          </w:p>
+        </w:tc>
+        <w:tc>
+          <w:tcPr>
+            <w:tcW w:type="dxa" w:w="1384"/>
+          </w:tcPr>
+          <w:p>
+            <w:pPr>
+              <w:jc w:val="center"/>
+            </w:pPr>
+            <w:r/>
+            <w:r>
+              <w:rPr>
+                <w:b w:val="0"/>
+                <w:sz w:val="16"/>
+              </w:rPr>
+              <w:t>112</w:t>
+            </w:r>
+          </w:p>
+        </w:tc>
+        <w:tc>
+          <w:tcPr>
+            <w:tcW w:type="dxa" w:w="1384"/>
+          </w:tcPr>
+          <w:p>
+            <w:pPr>
+              <w:jc w:val="center"/>
+            </w:pPr>
+            <w:r/>
+            <w:r>
+              <w:rPr>
+                <w:b w:val="0"/>
+                <w:sz w:val="16"/>
+              </w:rPr>
+              <w:t>Solo ord.</w:t>
+            </w:r>
+          </w:p>
+        </w:tc>
+        <w:tc>
+          <w:tcPr>
+            <w:tcW w:type="dxa" w:w="1384"/>
+          </w:tcPr>
+          <w:p>
+            <w:pPr>
+              <w:jc w:val="center"/>
+            </w:pPr>
+            <w:r/>
+            <w:r>
+              <w:rPr>
+                <w:b w:val="0"/>
+                <w:sz w:val="16"/>
+              </w:rPr>
+              <w:t>134</w:t>
+            </w:r>
+          </w:p>
+        </w:tc>
+        <w:tc>
+          <w:tcPr>
+            <w:tcW w:type="dxa" w:w="1384"/>
+          </w:tcPr>
+          <w:p>
+            <w:pPr>
+              <w:jc w:val="center"/>
+            </w:pPr>
+            <w:r/>
+            <w:r>
+              <w:rPr>
+                <w:b w:val="0"/>
+                <w:sz w:val="16"/>
+              </w:rPr>
+              <w:t>Le plus stable &lt; 4 %</w:t>
+            </w:r>
+          </w:p>
+        </w:tc>
+      </w:tr>
+      <w:tr>
+        <w:tc>
+          <w:tcPr>
+            <w:tcW w:type="dxa" w:w="1384"/>
+          </w:tcPr>
+          <w:p>
+            <w:pPr>
+              <w:jc w:val="center"/>
+            </w:pPr>
+            <w:r/>
+            <w:r>
+              <w:rPr>
+                <w:b/>
+                <w:sz w:val="16"/>
+              </w:rPr>
+              <w:t>Trompette</w:t>
+            </w:r>
+          </w:p>
+        </w:tc>
+        <w:tc>
+          <w:tcPr>
+            <w:tcW w:type="dxa" w:w="1384"/>
+          </w:tcPr>
+          <w:p>
+            <w:pPr>
+              <w:jc w:val="center"/>
+            </w:pPr>
+            <w:r/>
+            <w:r>
+              <w:rPr>
+                <w:b w:val="0"/>
+                <w:sz w:val="16"/>
+              </w:rPr>
+              <w:t>1 046</w:t>
+            </w:r>
+          </w:p>
+        </w:tc>
+        <w:tc>
+          <w:tcPr>
+            <w:tcW w:type="dxa" w:w="1384"/>
+          </w:tcPr>
+          <w:p>
+            <w:pPr>
+              <w:jc w:val="center"/>
+            </w:pPr>
+            <w:r/>
+            <w:r>
+              <w:rPr>
+                <w:b w:val="0"/>
+                <w:sz w:val="16"/>
+              </w:rPr>
+              <w:t>600–1 400</w:t>
+            </w:r>
+          </w:p>
+        </w:tc>
+        <w:tc>
+          <w:tcPr>
+            <w:tcW w:type="dxa" w:w="1384"/>
+          </w:tcPr>
+          <w:p>
+            <w:pPr>
+              <w:jc w:val="center"/>
+            </w:pPr>
+            <w:r/>
+            <w:r>
+              <w:rPr>
+                <w:b w:val="0"/>
+                <w:sz w:val="16"/>
+              </w:rPr>
+              <w:t>98</w:t>
+            </w:r>
+          </w:p>
+        </w:tc>
+        <w:tc>
+          <w:tcPr>
+            <w:tcW w:type="dxa" w:w="1384"/>
+          </w:tcPr>
+          <w:p>
+            <w:pPr>
+              <w:jc w:val="center"/>
+            </w:pPr>
+            <w:r/>
+            <w:r>
+              <w:rPr>
+                <w:b w:val="0"/>
+                <w:sz w:val="16"/>
+              </w:rPr>
+              <w:t>Solo ord.</w:t>
+            </w:r>
+          </w:p>
+        </w:tc>
+        <w:tc>
+          <w:tcPr>
+            <w:tcW w:type="dxa" w:w="1384"/>
+          </w:tcPr>
+          <w:p>
+            <w:pPr>
+              <w:jc w:val="center"/>
+            </w:pPr>
+            <w:r/>
+            <w:r>
+              <w:rPr>
+                <w:b w:val="0"/>
+                <w:sz w:val="16"/>
+              </w:rPr>
+              <w:t>96</w:t>
+            </w:r>
+          </w:p>
+        </w:tc>
+        <w:tc>
+          <w:tcPr>
+            <w:tcW w:type="dxa" w:w="1384"/>
+          </w:tcPr>
+          <w:p>
+            <w:pPr>
+              <w:jc w:val="center"/>
+            </w:pPr>
+            <w:r/>
+            <w:r>
+              <w:rPr>
+                <w:b w:val="0"/>
+                <w:sz w:val="16"/>
+              </w:rPr>
+              <w:t>10,4× &gt; F2</w:t>
+            </w:r>
+          </w:p>
+        </w:tc>
+      </w:tr>
+      <w:tr>
+        <w:tc>
+          <w:tcPr>
+            <w:tcW w:type="dxa" w:w="1384"/>
+          </w:tcPr>
+          <w:p>
+            <w:pPr>
+              <w:jc w:val="center"/>
+            </w:pPr>
+            <w:r/>
+            <w:r>
+              <w:rPr>
+                <w:b/>
+                <w:sz w:val="16"/>
+              </w:rPr>
+              <w:t>Trombone</w:t>
+            </w:r>
+          </w:p>
+        </w:tc>
+        <w:tc>
+          <w:tcPr>
+            <w:tcW w:type="dxa" w:w="1384"/>
+          </w:tcPr>
+          <w:p>
+            <w:pPr>
+              <w:jc w:val="center"/>
+            </w:pPr>
+            <w:r/>
+            <w:r>
+              <w:rPr>
+                <w:b w:val="0"/>
+                <w:sz w:val="16"/>
+              </w:rPr>
+              <w:t>1 218</w:t>
+            </w:r>
+          </w:p>
+        </w:tc>
+        <w:tc>
+          <w:tcPr>
+            <w:tcW w:type="dxa" w:w="1384"/>
+          </w:tcPr>
+          <w:p>
+            <w:pPr>
+              <w:jc w:val="center"/>
+            </w:pPr>
+            <w:r/>
+            <w:r>
+              <w:rPr>
+                <w:b w:val="0"/>
+                <w:sz w:val="16"/>
+              </w:rPr>
+              <w:t>1 000–2 000</w:t>
+            </w:r>
+          </w:p>
+        </w:tc>
+        <w:tc>
+          <w:tcPr>
+            <w:tcW w:type="dxa" w:w="1384"/>
+          </w:tcPr>
+          <w:p>
+            <w:pPr>
+              <w:jc w:val="center"/>
+            </w:pPr>
+            <w:r/>
+            <w:r>
+              <w:rPr>
+                <w:b w:val="0"/>
+                <w:sz w:val="16"/>
+              </w:rPr>
+              <w:t>~100</w:t>
+            </w:r>
+          </w:p>
+        </w:tc>
+        <w:tc>
+          <w:tcPr>
+            <w:tcW w:type="dxa" w:w="1384"/>
+          </w:tcPr>
+          <w:p>
+            <w:pPr>
+              <w:jc w:val="center"/>
+            </w:pPr>
+            <w:r/>
+            <w:r>
+              <w:rPr>
+                <w:b w:val="0"/>
+                <w:sz w:val="16"/>
+              </w:rPr>
+              <w:t>Solo ord.</w:t>
+            </w:r>
+          </w:p>
+        </w:tc>
+        <w:tc>
+          <w:tcPr>
+            <w:tcW w:type="dxa" w:w="1384"/>
+          </w:tcPr>
+          <w:p>
+            <w:pPr>
+              <w:jc w:val="center"/>
+            </w:pPr>
+            <w:r/>
+            <w:r>
+              <w:rPr>
+                <w:b w:val="0"/>
+                <w:sz w:val="16"/>
+              </w:rPr>
+              <w:t>117</w:t>
+            </w:r>
+          </w:p>
+        </w:tc>
+        <w:tc>
+          <w:tcPr>
+            <w:tcW w:type="dxa" w:w="1384"/>
+          </w:tcPr>
+          <w:p>
+            <w:pPr>
+              <w:jc w:val="center"/>
+            </w:pPr>
+            <w:r/>
+            <w:r>
+              <w:rPr>
+                <w:b w:val="0"/>
+                <w:sz w:val="16"/>
+              </w:rPr>
+              <w:t>Var. 6 %/registre</w:t>
+            </w:r>
+          </w:p>
+        </w:tc>
+      </w:tr>
+      <w:tr>
+        <w:tc>
+          <w:tcPr>
+            <w:tcW w:type="dxa" w:w="1384"/>
+          </w:tcPr>
+          <w:p>
+            <w:pPr>
+              <w:jc w:val="center"/>
+            </w:pPr>
+            <w:r/>
+            <w:r>
+              <w:rPr>
+                <w:b/>
+                <w:sz w:val="16"/>
+              </w:rPr>
+              <w:t>Tuba basse</w:t>
+            </w:r>
+          </w:p>
+        </w:tc>
+        <w:tc>
+          <w:tcPr>
+            <w:tcW w:type="dxa" w:w="1384"/>
+          </w:tcPr>
+          <w:p>
+            <w:pPr>
+              <w:jc w:val="center"/>
+            </w:pPr>
+            <w:r/>
+            <w:r>
+              <w:rPr>
+                <w:b w:val="0"/>
+                <w:sz w:val="16"/>
+              </w:rPr>
+              <w:t>1 239</w:t>
+            </w:r>
+          </w:p>
+        </w:tc>
+        <w:tc>
+          <w:tcPr>
+            <w:tcW w:type="dxa" w:w="1384"/>
+          </w:tcPr>
+          <w:p>
+            <w:pPr>
+              <w:jc w:val="center"/>
+            </w:pPr>
+            <w:r/>
+            <w:r>
+              <w:rPr>
+                <w:b w:val="0"/>
+                <w:sz w:val="16"/>
+              </w:rPr>
+              <w:t>1 000–2 000</w:t>
+            </w:r>
+          </w:p>
+        </w:tc>
+        <w:tc>
+          <w:tcPr>
+            <w:tcW w:type="dxa" w:w="1384"/>
+          </w:tcPr>
+          <w:p>
+            <w:pPr>
+              <w:jc w:val="center"/>
+            </w:pPr>
+            <w:r/>
+            <w:r>
+              <w:rPr>
+                <w:b w:val="0"/>
+                <w:sz w:val="16"/>
+              </w:rPr>
+              <w:t>~110</w:t>
+            </w:r>
+          </w:p>
+        </w:tc>
+        <w:tc>
+          <w:tcPr>
+            <w:tcW w:type="dxa" w:w="1384"/>
+          </w:tcPr>
+          <w:p>
+            <w:pPr>
+              <w:jc w:val="center"/>
+            </w:pPr>
+            <w:r/>
+            <w:r>
+              <w:rPr>
+                <w:b w:val="0"/>
+                <w:sz w:val="16"/>
+              </w:rPr>
+              <w:t>Solo ord.</w:t>
+            </w:r>
+          </w:p>
+        </w:tc>
+        <w:tc>
+          <w:tcPr>
+            <w:tcW w:type="dxa" w:w="1384"/>
+          </w:tcPr>
+          <w:p>
+            <w:pPr>
+              <w:jc w:val="center"/>
+            </w:pPr>
+            <w:r/>
+            <w:r>
+              <w:rPr>
+                <w:b w:val="0"/>
+                <w:sz w:val="16"/>
+              </w:rPr>
+              <w:t>108</w:t>
+            </w:r>
+          </w:p>
+        </w:tc>
+        <w:tc>
+          <w:tcPr>
+            <w:tcW w:type="dxa" w:w="1384"/>
+          </w:tcPr>
+          <w:p>
+            <w:pPr>
+              <w:jc w:val="center"/>
+            </w:pPr>
+            <w:r/>
+            <w:r>
+              <w:rPr>
+                <w:b w:val="0"/>
+                <w:sz w:val="16"/>
+              </w:rPr>
+              <w:t>—</w:t>
+            </w:r>
+          </w:p>
+        </w:tc>
+      </w:tr>
+      <w:tr>
+        <w:tc>
+          <w:tcPr>
+            <w:tcW w:type="dxa" w:w="1384"/>
+          </w:tcPr>
+          <w:p>
+            <w:pPr>
+              <w:jc w:val="center"/>
+            </w:pPr>
+            <w:r/>
+            <w:r>
+              <w:rPr>
+                <w:b/>
+                <w:sz w:val="16"/>
+              </w:rPr>
+              <w:t>Violon solo</w:t>
+            </w:r>
+          </w:p>
+        </w:tc>
+        <w:tc>
+          <w:tcPr>
+            <w:tcW w:type="dxa" w:w="1384"/>
+          </w:tcPr>
+          <w:p>
+            <w:pPr>
+              <w:jc w:val="center"/>
+            </w:pPr>
+            <w:r/>
+            <w:r>
+              <w:rPr>
+                <w:b w:val="0"/>
+                <w:sz w:val="16"/>
+              </w:rPr>
+              <w:t>893</w:t>
+            </w:r>
+          </w:p>
+        </w:tc>
+        <w:tc>
+          <w:tcPr>
+            <w:tcW w:type="dxa" w:w="1384"/>
+          </w:tcPr>
+          <w:p>
+            <w:pPr>
+              <w:jc w:val="center"/>
+            </w:pPr>
+            <w:r/>
+            <w:r>
+              <w:rPr>
+                <w:b w:val="0"/>
+                <w:sz w:val="16"/>
+              </w:rPr>
+              <w:t>600–1 400</w:t>
+            </w:r>
+          </w:p>
+        </w:tc>
+        <w:tc>
+          <w:tcPr>
+            <w:tcW w:type="dxa" w:w="1384"/>
+          </w:tcPr>
+          <w:p>
+            <w:pPr>
+              <w:jc w:val="center"/>
+            </w:pPr>
+            <w:r/>
+            <w:r>
+              <w:rPr>
+                <w:b w:val="0"/>
+                <w:sz w:val="16"/>
+              </w:rPr>
+              <w:t>92</w:t>
+            </w:r>
+          </w:p>
+        </w:tc>
+        <w:tc>
+          <w:tcPr>
+            <w:tcW w:type="dxa" w:w="1384"/>
+          </w:tcPr>
+          <w:p>
+            <w:pPr>
+              <w:jc w:val="center"/>
+            </w:pPr>
+            <w:r/>
+            <w:r>
+              <w:rPr>
+                <w:b w:val="0"/>
+                <w:sz w:val="16"/>
+              </w:rPr>
+              <w:t>Solo ord.</w:t>
+            </w:r>
+          </w:p>
+        </w:tc>
+        <w:tc>
+          <w:tcPr>
+            <w:tcW w:type="dxa" w:w="1384"/>
+          </w:tcPr>
+          <w:p>
+            <w:pPr>
+              <w:jc w:val="center"/>
+            </w:pPr>
+            <w:r/>
+            <w:r>
+              <w:rPr>
+                <w:b w:val="0"/>
+                <w:sz w:val="16"/>
+              </w:rPr>
+              <w:t>284</w:t>
+            </w:r>
+          </w:p>
+        </w:tc>
+        <w:tc>
+          <w:tcPr>
+            <w:tcW w:type="dxa" w:w="1384"/>
+          </w:tcPr>
+          <w:p>
+            <w:pPr>
+              <w:jc w:val="center"/>
+            </w:pPr>
+            <w:r/>
+            <w:r>
+              <w:rPr>
+                <w:b w:val="0"/>
+                <w:sz w:val="16"/>
+              </w:rPr>
+              <w:t>Ens.=970, sourd.=var.</w:t>
+            </w:r>
+          </w:p>
+        </w:tc>
+      </w:tr>
+      <w:tr>
+        <w:tc>
+          <w:tcPr>
+            <w:tcW w:type="dxa" w:w="1384"/>
+          </w:tcPr>
+          <w:p>
+            <w:pPr>
+              <w:jc w:val="center"/>
+            </w:pPr>
+            <w:r/>
+            <w:r>
+              <w:rPr>
+                <w:b/>
+                <w:sz w:val="16"/>
+              </w:rPr>
+              <w:t>Alto solo</w:t>
+            </w:r>
+          </w:p>
+        </w:tc>
+        <w:tc>
+          <w:tcPr>
+            <w:tcW w:type="dxa" w:w="1384"/>
+          </w:tcPr>
+          <w:p>
+            <w:pPr>
+              <w:jc w:val="center"/>
+            </w:pPr>
+            <w:r/>
+            <w:r>
+              <w:rPr>
+                <w:b w:val="0"/>
+                <w:sz w:val="16"/>
+              </w:rPr>
+              <w:t>1 300</w:t>
+            </w:r>
+          </w:p>
+        </w:tc>
+        <w:tc>
+          <w:tcPr>
+            <w:tcW w:type="dxa" w:w="1384"/>
+          </w:tcPr>
+          <w:p>
+            <w:pPr>
+              <w:jc w:val="center"/>
+            </w:pPr>
+            <w:r/>
+            <w:r>
+              <w:rPr>
+                <w:b w:val="0"/>
+                <w:sz w:val="16"/>
+              </w:rPr>
+              <w:t>800–1 600</w:t>
+            </w:r>
+          </w:p>
+        </w:tc>
+        <w:tc>
+          <w:tcPr>
+            <w:tcW w:type="dxa" w:w="1384"/>
+          </w:tcPr>
+          <w:p>
+            <w:pPr>
+              <w:jc w:val="center"/>
+            </w:pPr>
+            <w:r/>
+            <w:r>
+              <w:rPr>
+                <w:b w:val="0"/>
+                <w:sz w:val="16"/>
+              </w:rPr>
+              <w:t>~120</w:t>
+            </w:r>
+          </w:p>
+        </w:tc>
+        <w:tc>
+          <w:tcPr>
+            <w:tcW w:type="dxa" w:w="1384"/>
+          </w:tcPr>
+          <w:p>
+            <w:pPr>
+              <w:jc w:val="center"/>
+            </w:pPr>
+            <w:r/>
+            <w:r>
+              <w:rPr>
+                <w:b w:val="0"/>
+                <w:sz w:val="16"/>
+              </w:rPr>
+              <w:t>Solo ord.</w:t>
+            </w:r>
+          </w:p>
+        </w:tc>
+        <w:tc>
+          <w:tcPr>
+            <w:tcW w:type="dxa" w:w="1384"/>
+          </w:tcPr>
+          <w:p>
+            <w:pPr>
+              <w:jc w:val="center"/>
+            </w:pPr>
+            <w:r/>
+            <w:r>
+              <w:rPr>
+                <w:b w:val="0"/>
+                <w:sz w:val="16"/>
+              </w:rPr>
+              <w:t>309</w:t>
+            </w:r>
+          </w:p>
+        </w:tc>
+        <w:tc>
+          <w:tcPr>
+            <w:tcW w:type="dxa" w:w="1384"/>
+          </w:tcPr>
+          <w:p>
+            <w:pPr>
+              <w:jc w:val="center"/>
+            </w:pPr>
+            <w:r/>
+            <w:r>
+              <w:rPr>
+                <w:b w:val="0"/>
+                <w:sz w:val="16"/>
+              </w:rPr>
+              <w:t>Ens.=954</w:t>
+            </w:r>
+          </w:p>
+        </w:tc>
+      </w:tr>
+      <w:tr>
+        <w:tc>
+          <w:tcPr>
+            <w:tcW w:type="dxa" w:w="1384"/>
+          </w:tcPr>
+          <w:p>
+            <w:pPr>
+              <w:jc w:val="center"/>
+            </w:pPr>
+            <w:r/>
+            <w:r>
+              <w:rPr>
+                <w:b/>
+                <w:sz w:val="16"/>
+              </w:rPr>
+              <w:t>Violoncelle</w:t>
+            </w:r>
+          </w:p>
+        </w:tc>
+        <w:tc>
+          <w:tcPr>
+            <w:tcW w:type="dxa" w:w="1384"/>
+          </w:tcPr>
+          <w:p>
+            <w:pPr>
+              <w:jc w:val="center"/>
+            </w:pPr>
+            <w:r/>
+            <w:r>
+              <w:rPr>
+                <w:b w:val="0"/>
+                <w:sz w:val="16"/>
+              </w:rPr>
+              <w:t>1 242</w:t>
+            </w:r>
+          </w:p>
+        </w:tc>
+        <w:tc>
+          <w:tcPr>
+            <w:tcW w:type="dxa" w:w="1384"/>
+          </w:tcPr>
+          <w:p>
+            <w:pPr>
+              <w:jc w:val="center"/>
+            </w:pPr>
+            <w:r/>
+            <w:r>
+              <w:rPr>
+                <w:b w:val="0"/>
+                <w:sz w:val="16"/>
+              </w:rPr>
+              <w:t>600–1 400</w:t>
+            </w:r>
+          </w:p>
+        </w:tc>
+        <w:tc>
+          <w:tcPr>
+            <w:tcW w:type="dxa" w:w="1384"/>
+          </w:tcPr>
+          <w:p>
+            <w:pPr>
+              <w:jc w:val="center"/>
+            </w:pPr>
+            <w:r/>
+            <w:r>
+              <w:rPr>
+                <w:b w:val="0"/>
+                <w:sz w:val="16"/>
+              </w:rPr>
+              <w:t>~80</w:t>
+            </w:r>
+          </w:p>
+        </w:tc>
+        <w:tc>
+          <w:tcPr>
+            <w:tcW w:type="dxa" w:w="1384"/>
+          </w:tcPr>
+          <w:p>
+            <w:pPr>
+              <w:jc w:val="center"/>
+            </w:pPr>
+            <w:r/>
+            <w:r>
+              <w:rPr>
+                <w:b w:val="0"/>
+                <w:sz w:val="16"/>
+              </w:rPr>
+              <w:t>Solo ord.</w:t>
+            </w:r>
+          </w:p>
+        </w:tc>
+        <w:tc>
+          <w:tcPr>
+            <w:tcW w:type="dxa" w:w="1384"/>
+          </w:tcPr>
+          <w:p>
+            <w:pPr>
+              <w:jc w:val="center"/>
+            </w:pPr>
+            <w:r/>
+            <w:r>
+              <w:rPr>
+                <w:b w:val="0"/>
+                <w:sz w:val="16"/>
+              </w:rPr>
+              <w:t>291</w:t>
+            </w:r>
+          </w:p>
+        </w:tc>
+        <w:tc>
+          <w:tcPr>
+            <w:tcW w:type="dxa" w:w="1384"/>
+          </w:tcPr>
+          <w:p>
+            <w:pPr>
+              <w:jc w:val="center"/>
+            </w:pPr>
+            <w:r/>
+            <w:r>
+              <w:rPr>
+                <w:b w:val="0"/>
+                <w:sz w:val="16"/>
+              </w:rPr>
+              <w:t>Ens.=1 471</w:t>
+            </w:r>
+          </w:p>
+        </w:tc>
+      </w:tr>
+      <w:tr>
+        <w:tc>
+          <w:tcPr>
+            <w:tcW w:type="dxa" w:w="1384"/>
+          </w:tcPr>
+          <w:p>
+            <w:pPr>
+              <w:jc w:val="center"/>
+            </w:pPr>
+            <w:r/>
+            <w:r>
+              <w:rPr>
+                <w:b/>
+                <w:sz w:val="16"/>
+              </w:rPr>
+              <w:t>Contrebasse</w:t>
+            </w:r>
+          </w:p>
+        </w:tc>
+        <w:tc>
+          <w:tcPr>
+            <w:tcW w:type="dxa" w:w="1384"/>
+          </w:tcPr>
+          <w:p>
+            <w:pPr>
+              <w:jc w:val="center"/>
+            </w:pPr>
+            <w:r/>
+            <w:r>
+              <w:rPr>
+                <w:b w:val="0"/>
+                <w:sz w:val="16"/>
+              </w:rPr>
+              <w:t>1 235</w:t>
+            </w:r>
+          </w:p>
+        </w:tc>
+        <w:tc>
+          <w:tcPr>
+            <w:tcW w:type="dxa" w:w="1384"/>
+          </w:tcPr>
+          <w:p>
+            <w:pPr>
+              <w:jc w:val="center"/>
+            </w:pPr>
+            <w:r/>
+            <w:r>
+              <w:rPr>
+                <w:b w:val="0"/>
+                <w:sz w:val="16"/>
+              </w:rPr>
+              <w:t>1 000–2 000</w:t>
+            </w:r>
+          </w:p>
+        </w:tc>
+        <w:tc>
+          <w:tcPr>
+            <w:tcW w:type="dxa" w:w="1384"/>
+          </w:tcPr>
+          <w:p>
+            <w:pPr>
+              <w:jc w:val="center"/>
+            </w:pPr>
+            <w:r/>
+            <w:r>
+              <w:rPr>
+                <w:b w:val="0"/>
+                <w:sz w:val="16"/>
+              </w:rPr>
+              <w:t>~50</w:t>
+            </w:r>
+          </w:p>
+        </w:tc>
+        <w:tc>
+          <w:tcPr>
+            <w:tcW w:type="dxa" w:w="1384"/>
+          </w:tcPr>
+          <w:p>
+            <w:pPr>
+              <w:jc w:val="center"/>
+            </w:pPr>
+            <w:r/>
+            <w:r>
+              <w:rPr>
+                <w:b w:val="0"/>
+                <w:sz w:val="16"/>
+              </w:rPr>
+              <w:t>Solo ord.</w:t>
+            </w:r>
+          </w:p>
+        </w:tc>
+        <w:tc>
+          <w:tcPr>
+            <w:tcW w:type="dxa" w:w="1384"/>
+          </w:tcPr>
+          <w:p>
+            <w:pPr>
+              <w:jc w:val="center"/>
+            </w:pPr>
+            <w:r/>
+            <w:r>
+              <w:rPr>
+                <w:b w:val="0"/>
+                <w:sz w:val="16"/>
+              </w:rPr>
+              <w:t>309</w:t>
+            </w:r>
+          </w:p>
+        </w:tc>
+        <w:tc>
+          <w:tcPr>
+            <w:tcW w:type="dxa" w:w="1384"/>
+          </w:tcPr>
+          <w:p>
+            <w:pPr>
+              <w:jc w:val="center"/>
+            </w:pPr>
+            <w:r/>
+            <w:r>
+              <w:rPr>
+                <w:b w:val="0"/>
+                <w:sz w:val="16"/>
+              </w:rPr>
+              <w:t>Ens.=1 146</w:t>
+            </w:r>
+          </w:p>
+        </w:tc>
+      </w:tr>
+    </w:tbl>
     <w:sectPr>
       <w:pgSz w:w="12240" w:h="15840"/>
       <w:pgMar w:top="1134" w:right="1134" w:bottom="1134" w:left="1417" w:header="720" w:footer="720" w:gutter="0"/>

</xml_diff>